<commit_message>
Adds height and cert with a student role for Milana
</commit_message>
<xml_diff>
--- a/templates/height_certificate.docx
+++ b/templates/height_certificate.docx
@@ -77,6 +77,7 @@
                 <w:sz w:val="18"/>
                 <w:szCs w:val="18"/>
                 <w:u w:val="single"/>
+                <w:lang w:val="en-US"/>
               </w:rPr>
             </w:pPr>
             <w:r>
@@ -95,6 +96,7 @@
                 <w:bCs/>
                 <w:sz w:val="18"/>
                 <w:szCs w:val="18"/>
+                <w:lang w:val="en-US"/>
               </w:rPr>
               <w:t xml:space="preserve"> </w:t>
             </w:r>
@@ -106,6 +108,7 @@
                 <w:sz w:val="18"/>
                 <w:szCs w:val="18"/>
                 <w:u w:val="single"/>
+                <w:lang w:val="en-US"/>
               </w:rPr>
               <w:t xml:space="preserve">№ </w:t>
             </w:r>
@@ -118,6 +121,7 @@
                 <w:sz w:val="18"/>
                 <w:szCs w:val="18"/>
                 <w:u w:val="single"/>
+                <w:lang w:val="en-US"/>
               </w:rPr>
               <w:t xml:space="preserve">{{ </w:t>
             </w:r>
@@ -142,6 +146,7 @@
                 <w:sz w:val="18"/>
                 <w:szCs w:val="18"/>
                 <w:u w:val="single"/>
+                <w:lang w:val="en-US"/>
               </w:rPr>
               <w:t>_</w:t>
             </w:r>
@@ -165,6 +170,7 @@
                 <w:sz w:val="18"/>
                 <w:szCs w:val="18"/>
                 <w:u w:val="single"/>
+                <w:lang w:val="en-US"/>
               </w:rPr>
               <w:t xml:space="preserve"> }}</w:t>
             </w:r>
@@ -176,6 +182,7 @@
                 <w:sz w:val="18"/>
                 <w:szCs w:val="18"/>
                 <w:u w:val="single"/>
+                <w:lang w:val="en-US"/>
               </w:rPr>
               <w:t>-</w:t>
             </w:r>
@@ -187,6 +194,7 @@
                 <w:sz w:val="18"/>
                 <w:szCs w:val="18"/>
                 <w:u w:val="single"/>
+                <w:lang w:val="en-US"/>
               </w:rPr>
               <w:t>{{</w:t>
             </w:r>
@@ -210,6 +218,7 @@
                 <w:sz w:val="18"/>
                 <w:szCs w:val="18"/>
                 <w:u w:val="single"/>
+                <w:lang w:val="en-US"/>
               </w:rPr>
               <w:t>}}</w:t>
             </w:r>
@@ -225,6 +234,7 @@
                 <w:sz w:val="18"/>
                 <w:szCs w:val="18"/>
                 <w:u w:val="single"/>
+                <w:lang w:val="en-US"/>
               </w:rPr>
             </w:pPr>
           </w:p>
@@ -236,6 +246,7 @@
                 <w:rFonts w:ascii="Times New Roman" w:hAnsi="Times New Roman" w:cs="Times New Roman"/>
                 <w:sz w:val="18"/>
                 <w:szCs w:val="18"/>
+                <w:lang w:val="en-US"/>
               </w:rPr>
             </w:pPr>
           </w:p>
@@ -251,6 +262,7 @@
                 <w:bCs/>
                 <w:sz w:val="18"/>
                 <w:szCs w:val="18"/>
+                <w:lang w:val="en-US"/>
               </w:rPr>
             </w:pPr>
             <w:proofErr w:type="gramStart"/>
@@ -261,6 +273,7 @@
                 <w:bCs/>
                 <w:sz w:val="18"/>
                 <w:szCs w:val="18"/>
+                <w:lang w:val="en-US"/>
               </w:rPr>
               <w:t xml:space="preserve">{{ </w:t>
             </w:r>
@@ -283,6 +296,7 @@
                 <w:bCs/>
                 <w:sz w:val="18"/>
                 <w:szCs w:val="18"/>
+                <w:lang w:val="en-US"/>
               </w:rPr>
               <w:t>_</w:t>
             </w:r>
@@ -304,6 +318,7 @@
                 <w:bCs/>
                 <w:sz w:val="18"/>
                 <w:szCs w:val="18"/>
+                <w:lang w:val="en-US"/>
               </w:rPr>
               <w:t xml:space="preserve"> }}</w:t>
             </w:r>
@@ -419,16 +434,15 @@
                 <w:b/>
                 <w:sz w:val="18"/>
                 <w:szCs w:val="18"/>
-                <w:lang w:val="en-US"/>
-              </w:rPr>
-            </w:pPr>
-            <w:r>
-              <w:rPr>
-                <w:rFonts w:ascii="Times New Roman" w:hAnsi="Times New Roman" w:cs="Times New Roman"/>
-                <w:b/>
-                <w:sz w:val="18"/>
-                <w:szCs w:val="18"/>
-                <w:lang w:val="en-US"/>
+              </w:rPr>
+            </w:pPr>
+            <w:proofErr w:type="gramStart"/>
+            <w:r>
+              <w:rPr>
+                <w:rFonts w:ascii="Times New Roman" w:hAnsi="Times New Roman" w:cs="Times New Roman"/>
+                <w:b/>
+                <w:sz w:val="18"/>
+                <w:szCs w:val="18"/>
               </w:rPr>
               <w:t xml:space="preserve">{{ </w:t>
             </w:r>
@@ -441,16 +455,37 @@
                 <w:szCs w:val="18"/>
                 <w:lang w:val="en-US"/>
               </w:rPr>
-              <w:t>student_role</w:t>
+              <w:t>student</w:t>
             </w:r>
             <w:proofErr w:type="spellEnd"/>
-            <w:r>
-              <w:rPr>
-                <w:rFonts w:ascii="Times New Roman" w:hAnsi="Times New Roman" w:cs="Times New Roman"/>
-                <w:b/>
-                <w:sz w:val="18"/>
-                <w:szCs w:val="18"/>
-                <w:lang w:val="en-US"/>
+            <w:proofErr w:type="gramEnd"/>
+            <w:r>
+              <w:rPr>
+                <w:rFonts w:ascii="Times New Roman" w:hAnsi="Times New Roman" w:cs="Times New Roman"/>
+                <w:b/>
+                <w:sz w:val="18"/>
+                <w:szCs w:val="18"/>
+              </w:rPr>
+              <w:t>_</w:t>
+            </w:r>
+            <w:proofErr w:type="spellStart"/>
+            <w:r>
+              <w:rPr>
+                <w:rFonts w:ascii="Times New Roman" w:hAnsi="Times New Roman" w:cs="Times New Roman"/>
+                <w:b/>
+                <w:sz w:val="18"/>
+                <w:szCs w:val="18"/>
+                <w:lang w:val="en-US"/>
+              </w:rPr>
+              <w:t>role</w:t>
+            </w:r>
+            <w:proofErr w:type="spellEnd"/>
+            <w:r>
+              <w:rPr>
+                <w:rFonts w:ascii="Times New Roman" w:hAnsi="Times New Roman" w:cs="Times New Roman"/>
+                <w:b/>
+                <w:sz w:val="18"/>
+                <w:szCs w:val="18"/>
               </w:rPr>
               <w:t xml:space="preserve"> }}</w:t>
             </w:r>
@@ -460,7 +495,6 @@
                 <w:b/>
                 <w:sz w:val="18"/>
                 <w:szCs w:val="18"/>
-                <w:lang w:val="en-US"/>
               </w:rPr>
               <w:t xml:space="preserve">    </w:t>
             </w:r>
@@ -477,7 +511,6 @@
                 <w:iCs/>
                 <w:sz w:val="18"/>
                 <w:szCs w:val="18"/>
-                <w:lang w:val="en-US"/>
               </w:rPr>
             </w:pPr>
             <w:r>
@@ -487,7 +520,6 @@
                 <w:iCs/>
                 <w:sz w:val="18"/>
                 <w:szCs w:val="18"/>
-                <w:lang w:val="en-US"/>
               </w:rPr>
               <w:t>(</w:t>
             </w:r>
@@ -508,7 +540,6 @@
                 <w:iCs/>
                 <w:sz w:val="18"/>
                 <w:szCs w:val="18"/>
-                <w:lang w:val="en-US"/>
               </w:rPr>
               <w:t xml:space="preserve">, </w:t>
             </w:r>
@@ -529,7 +560,6 @@
                 <w:iCs/>
                 <w:sz w:val="18"/>
                 <w:szCs w:val="18"/>
-                <w:lang w:val="en-US"/>
               </w:rPr>
               <w:t>)</w:t>
             </w:r>
@@ -546,7 +576,6 @@
                 <w:iCs/>
                 <w:sz w:val="18"/>
                 <w:szCs w:val="18"/>
-                <w:lang w:val="en-US"/>
               </w:rPr>
             </w:pPr>
           </w:p>
@@ -562,17 +591,16 @@
                 <w:bCs/>
                 <w:sz w:val="18"/>
                 <w:szCs w:val="18"/>
-                <w:lang w:val="en-US"/>
-              </w:rPr>
-            </w:pPr>
-            <w:r>
-              <w:rPr>
-                <w:rFonts w:ascii="Times New Roman" w:hAnsi="Times New Roman" w:cs="Times New Roman"/>
-                <w:b/>
-                <w:bCs/>
-                <w:sz w:val="18"/>
-                <w:szCs w:val="18"/>
-                <w:lang w:val="en-US"/>
+              </w:rPr>
+            </w:pPr>
+            <w:proofErr w:type="gramStart"/>
+            <w:r>
+              <w:rPr>
+                <w:rFonts w:ascii="Times New Roman" w:hAnsi="Times New Roman" w:cs="Times New Roman"/>
+                <w:b/>
+                <w:bCs/>
+                <w:sz w:val="18"/>
+                <w:szCs w:val="18"/>
               </w:rPr>
               <w:t xml:space="preserve">{{ </w:t>
             </w:r>
@@ -586,17 +614,40 @@
                 <w:szCs w:val="18"/>
                 <w:lang w:val="en-US"/>
               </w:rPr>
-              <w:t>student_company</w:t>
+              <w:t>student</w:t>
             </w:r>
             <w:proofErr w:type="spellEnd"/>
-            <w:r>
-              <w:rPr>
-                <w:rFonts w:ascii="Times New Roman" w:hAnsi="Times New Roman" w:cs="Times New Roman"/>
-                <w:b/>
-                <w:bCs/>
-                <w:sz w:val="18"/>
-                <w:szCs w:val="18"/>
-                <w:lang w:val="en-US"/>
+            <w:proofErr w:type="gramEnd"/>
+            <w:r>
+              <w:rPr>
+                <w:rFonts w:ascii="Times New Roman" w:hAnsi="Times New Roman" w:cs="Times New Roman"/>
+                <w:b/>
+                <w:bCs/>
+                <w:sz w:val="18"/>
+                <w:szCs w:val="18"/>
+              </w:rPr>
+              <w:t>_</w:t>
+            </w:r>
+            <w:proofErr w:type="spellStart"/>
+            <w:r>
+              <w:rPr>
+                <w:rFonts w:ascii="Times New Roman" w:hAnsi="Times New Roman" w:cs="Times New Roman"/>
+                <w:b/>
+                <w:bCs/>
+                <w:sz w:val="18"/>
+                <w:szCs w:val="18"/>
+                <w:lang w:val="en-US"/>
+              </w:rPr>
+              <w:t>company</w:t>
+            </w:r>
+            <w:proofErr w:type="spellEnd"/>
+            <w:r>
+              <w:rPr>
+                <w:rFonts w:ascii="Times New Roman" w:hAnsi="Times New Roman" w:cs="Times New Roman"/>
+                <w:b/>
+                <w:bCs/>
+                <w:sz w:val="18"/>
+                <w:szCs w:val="18"/>
               </w:rPr>
               <w:t xml:space="preserve"> }}</w:t>
             </w:r>
@@ -623,7 +674,27 @@
                 <w:sz w:val="18"/>
                 <w:szCs w:val="18"/>
               </w:rPr>
-              <w:t>(организация)</w:t>
+              <w:t>(</w:t>
+            </w:r>
+            <w:r>
+              <w:rPr>
+                <w:rFonts w:ascii="Times New Roman" w:hAnsi="Times New Roman" w:cs="Times New Roman"/>
+                <w:i/>
+                <w:iCs/>
+                <w:sz w:val="18"/>
+                <w:szCs w:val="18"/>
+              </w:rPr>
+              <w:t>организация</w:t>
+            </w:r>
+            <w:r>
+              <w:rPr>
+                <w:rFonts w:ascii="Times New Roman" w:hAnsi="Times New Roman" w:cs="Times New Roman"/>
+                <w:i/>
+                <w:iCs/>
+                <w:sz w:val="18"/>
+                <w:szCs w:val="18"/>
+              </w:rPr>
+              <w:t>)</w:t>
             </w:r>
           </w:p>
           <w:p>
@@ -654,188 +725,191 @@
           </w:p>
           <w:p>
             <w:pPr>
-              <w:spacing w:after="0" w:line="192" w:lineRule="auto"/>
-              <w:ind w:left="-57" w:right="-57"/>
-              <w:rPr>
-                <w:rFonts w:ascii="Times New Roman" w:hAnsi="Times New Roman" w:cs="Times New Roman"/>
-                <w:sz w:val="18"/>
-                <w:szCs w:val="18"/>
-              </w:rPr>
-            </w:pPr>
-            <w:r>
-              <w:rPr>
-                <w:rFonts w:ascii="Times New Roman" w:hAnsi="Times New Roman" w:cs="Times New Roman"/>
-                <w:sz w:val="18"/>
-                <w:szCs w:val="18"/>
-              </w:rPr>
-              <w:t>Дата выдачи            Действительно до</w:t>
-            </w:r>
-          </w:p>
-          <w:p>
-            <w:pPr>
               <w:suppressAutoHyphens w:val="0"/>
               <w:spacing w:after="0" w:line="192" w:lineRule="auto"/>
               <w:ind w:left="-57" w:right="-57"/>
               <w:rPr>
                 <w:rFonts w:ascii="Times New Roman" w:hAnsi="Times New Roman" w:cs="Times New Roman"/>
                 <w:b/>
+                <w:bCs/>
+                <w:sz w:val="18"/>
+                <w:szCs w:val="18"/>
+                <w:lang w:val="en-US"/>
+              </w:rPr>
+            </w:pPr>
+            <w:r>
+              <w:rPr>
+                <w:rFonts w:ascii="Times New Roman" w:hAnsi="Times New Roman" w:cs="Times New Roman"/>
+                <w:b/>
+                <w:bCs/>
+                <w:sz w:val="18"/>
+                <w:szCs w:val="18"/>
+              </w:rPr>
+              <w:t>Дата</w:t>
+            </w:r>
+            <w:r>
+              <w:rPr>
+                <w:rFonts w:ascii="Times New Roman" w:hAnsi="Times New Roman" w:cs="Times New Roman"/>
+                <w:b/>
+                <w:bCs/>
+                <w:sz w:val="18"/>
+                <w:szCs w:val="18"/>
+                <w:lang w:val="en-US"/>
+              </w:rPr>
+              <w:t xml:space="preserve"> </w:t>
+            </w:r>
+            <w:r>
+              <w:rPr>
+                <w:rFonts w:ascii="Times New Roman" w:hAnsi="Times New Roman" w:cs="Times New Roman"/>
+                <w:b/>
+                <w:bCs/>
+                <w:sz w:val="18"/>
+                <w:szCs w:val="18"/>
+              </w:rPr>
+              <w:t>выдачи</w:t>
+            </w:r>
+            <w:r>
+              <w:rPr>
+                <w:rFonts w:ascii="Times New Roman" w:hAnsi="Times New Roman" w:cs="Times New Roman"/>
+                <w:b/>
+                <w:bCs/>
+                <w:sz w:val="18"/>
+                <w:szCs w:val="18"/>
+                <w:lang w:val="en-US"/>
+              </w:rPr>
+              <w:t xml:space="preserve"> </w:t>
+            </w:r>
+            <w:proofErr w:type="gramStart"/>
+            <w:r>
+              <w:rPr>
+                <w:rFonts w:ascii="Times New Roman" w:hAnsi="Times New Roman" w:cs="Times New Roman"/>
+                <w:b/>
+                <w:bCs/>
+                <w:sz w:val="18"/>
+                <w:szCs w:val="18"/>
+                <w:lang w:val="en-US"/>
+              </w:rPr>
+              <w:t xml:space="preserve">{{ </w:t>
+            </w:r>
+            <w:proofErr w:type="spellStart"/>
+            <w:r>
+              <w:rPr>
+                <w:rFonts w:ascii="Times New Roman" w:hAnsi="Times New Roman" w:cs="Times New Roman"/>
+                <w:b/>
+                <w:bCs/>
+                <w:sz w:val="18"/>
+                <w:szCs w:val="18"/>
+                <w:lang w:val="en-US"/>
+              </w:rPr>
+              <w:t>end</w:t>
+            </w:r>
+            <w:proofErr w:type="gramEnd"/>
+            <w:r>
+              <w:rPr>
+                <w:rFonts w:ascii="Times New Roman" w:hAnsi="Times New Roman" w:cs="Times New Roman"/>
+                <w:b/>
+                <w:bCs/>
+                <w:sz w:val="18"/>
+                <w:szCs w:val="18"/>
+                <w:lang w:val="en-US"/>
+              </w:rPr>
+              <w:t>_date</w:t>
+            </w:r>
+            <w:proofErr w:type="spellEnd"/>
+            <w:r>
+              <w:rPr>
+                <w:rFonts w:ascii="Times New Roman" w:hAnsi="Times New Roman" w:cs="Times New Roman"/>
+                <w:b/>
+                <w:bCs/>
+                <w:sz w:val="18"/>
+                <w:szCs w:val="18"/>
+                <w:lang w:val="en-US"/>
+              </w:rPr>
+              <w:t xml:space="preserve"> }}   </w:t>
+            </w:r>
+          </w:p>
+          <w:p>
+            <w:pPr>
+              <w:suppressAutoHyphens w:val="0"/>
+              <w:spacing w:after="0" w:line="192" w:lineRule="auto"/>
+              <w:ind w:left="-57" w:right="-57"/>
+              <w:rPr>
+                <w:rFonts w:ascii="Times New Roman" w:hAnsi="Times New Roman" w:cs="Times New Roman"/>
+                <w:b/>
+                <w:bCs/>
+                <w:sz w:val="18"/>
+                <w:szCs w:val="18"/>
+                <w:lang w:val="en-US"/>
+              </w:rPr>
+            </w:pPr>
+            <w:proofErr w:type="gramStart"/>
+            <w:r>
+              <w:rPr>
+                <w:rFonts w:ascii="Times New Roman" w:hAnsi="Times New Roman" w:cs="Times New Roman"/>
+                <w:b/>
+                <w:bCs/>
+                <w:sz w:val="18"/>
+                <w:szCs w:val="18"/>
+                <w:lang w:val="en-US"/>
+              </w:rPr>
+              <w:t xml:space="preserve">{{ </w:t>
+            </w:r>
+            <w:proofErr w:type="spellStart"/>
+            <w:r>
+              <w:rPr>
+                <w:rFonts w:ascii="Times New Roman" w:hAnsi="Times New Roman" w:cs="Times New Roman"/>
+                <w:b/>
+                <w:bCs/>
+                <w:sz w:val="18"/>
+                <w:szCs w:val="18"/>
+                <w:lang w:val="en-US"/>
+              </w:rPr>
+              <w:t>expiration</w:t>
+            </w:r>
+            <w:proofErr w:type="gramEnd"/>
+            <w:r>
+              <w:rPr>
+                <w:rFonts w:ascii="Times New Roman" w:hAnsi="Times New Roman" w:cs="Times New Roman"/>
+                <w:b/>
+                <w:bCs/>
+                <w:sz w:val="18"/>
+                <w:szCs w:val="18"/>
+                <w:lang w:val="en-US"/>
+              </w:rPr>
+              <w:t>_date</w:t>
+            </w:r>
+            <w:proofErr w:type="spellEnd"/>
+            <w:r>
+              <w:rPr>
+                <w:rFonts w:ascii="Times New Roman" w:hAnsi="Times New Roman" w:cs="Times New Roman"/>
+                <w:b/>
+                <w:bCs/>
+                <w:sz w:val="18"/>
+                <w:szCs w:val="18"/>
+                <w:lang w:val="en-US"/>
+              </w:rPr>
+              <w:t xml:space="preserve"> }}</w:t>
+            </w:r>
+          </w:p>
+          <w:p>
+            <w:pPr>
+              <w:spacing w:after="0" w:line="192" w:lineRule="auto"/>
+              <w:ind w:left="-57" w:right="-57"/>
+              <w:rPr>
+                <w:rFonts w:ascii="Times New Roman" w:hAnsi="Times New Roman" w:cs="Times New Roman"/>
+                <w:b/>
                 <w:sz w:val="16"/>
                 <w:szCs w:val="16"/>
-                <w:lang w:val="en-US"/>
-              </w:rPr>
-            </w:pPr>
-            <w:r>
-              <w:rPr>
-                <w:rFonts w:ascii="Times New Roman" w:hAnsi="Times New Roman" w:cs="Times New Roman"/>
-                <w:b/>
+              </w:rPr>
+            </w:pPr>
+            <w:r>
+              <w:rPr>
+                <w:rFonts w:ascii="Times New Roman" w:hAnsi="Times New Roman" w:cs="Times New Roman"/>
+                <w:bCs/>
                 <w:sz w:val="16"/>
                 <w:szCs w:val="16"/>
-                <w:lang w:val="en-US"/>
-              </w:rPr>
-              <w:t xml:space="preserve">{{ </w:t>
-            </w:r>
-            <w:proofErr w:type="spellStart"/>
-            <w:r>
-              <w:rPr>
-                <w:rFonts w:ascii="Times New Roman" w:hAnsi="Times New Roman" w:cs="Times New Roman"/>
-                <w:b/>
-                <w:sz w:val="16"/>
-                <w:szCs w:val="16"/>
-                <w:lang w:val="en-US"/>
-              </w:rPr>
-              <w:t>end_date</w:t>
-            </w:r>
-            <w:proofErr w:type="spellEnd"/>
-            <w:r>
-              <w:rPr>
-                <w:rFonts w:ascii="Times New Roman" w:hAnsi="Times New Roman" w:cs="Times New Roman"/>
-                <w:b/>
-                <w:sz w:val="16"/>
-                <w:szCs w:val="16"/>
-                <w:lang w:val="en-US"/>
-              </w:rPr>
-              <w:t xml:space="preserve"> }}</w:t>
-            </w:r>
-            <w:r>
-              <w:rPr>
-                <w:rFonts w:ascii="Times New Roman" w:hAnsi="Times New Roman" w:cs="Times New Roman"/>
-                <w:b/>
-                <w:sz w:val="16"/>
-                <w:szCs w:val="16"/>
-                <w:lang w:val="en-US"/>
-              </w:rPr>
-              <w:t xml:space="preserve"> </w:t>
-            </w:r>
-            <w:r>
-              <w:rPr>
-                <w:rFonts w:ascii="Times New Roman" w:hAnsi="Times New Roman" w:cs="Times New Roman"/>
-                <w:b/>
-                <w:sz w:val="16"/>
-                <w:szCs w:val="16"/>
-                <w:lang w:val="en-US"/>
-              </w:rPr>
-              <w:t xml:space="preserve">   </w:t>
-            </w:r>
-            <w:r>
-              <w:rPr>
-                <w:rFonts w:ascii="Times New Roman" w:hAnsi="Times New Roman" w:cs="Times New Roman"/>
-                <w:b/>
-                <w:sz w:val="16"/>
-                <w:szCs w:val="16"/>
-              </w:rPr>
-              <w:t xml:space="preserve"> </w:t>
-            </w:r>
-            <w:r>
-              <w:rPr>
-                <w:rFonts w:ascii="Times New Roman" w:hAnsi="Times New Roman" w:cs="Times New Roman"/>
-                <w:b/>
-                <w:sz w:val="16"/>
-                <w:szCs w:val="16"/>
-              </w:rPr>
-              <w:t xml:space="preserve">   </w:t>
-            </w:r>
-            <w:r>
-              <w:rPr>
-                <w:rFonts w:ascii="Times New Roman" w:hAnsi="Times New Roman" w:cs="Times New Roman"/>
-                <w:b/>
-                <w:sz w:val="16"/>
-                <w:szCs w:val="16"/>
-                <w:lang w:val="en-US"/>
-              </w:rPr>
-              <w:t xml:space="preserve">{{ </w:t>
-            </w:r>
-            <w:proofErr w:type="spellStart"/>
-            <w:r>
-              <w:rPr>
-                <w:rFonts w:ascii="Times New Roman" w:hAnsi="Times New Roman" w:cs="Times New Roman"/>
-                <w:b/>
-                <w:sz w:val="16"/>
-                <w:szCs w:val="16"/>
-                <w:lang w:val="en-US"/>
-              </w:rPr>
-              <w:t>expiration_date</w:t>
-            </w:r>
-            <w:proofErr w:type="spellEnd"/>
-            <w:r>
-              <w:rPr>
-                <w:rFonts w:ascii="Times New Roman" w:hAnsi="Times New Roman" w:cs="Times New Roman"/>
-                <w:b/>
-                <w:sz w:val="16"/>
-                <w:szCs w:val="16"/>
-                <w:lang w:val="en-US"/>
-              </w:rPr>
-              <w:t xml:space="preserve"> }}</w:t>
-            </w:r>
-          </w:p>
-          <w:p>
-            <w:pPr>
-              <w:spacing w:after="0" w:line="192" w:lineRule="auto"/>
-              <w:ind w:left="-57" w:right="-57"/>
-              <w:rPr>
-                <w:rFonts w:ascii="Times New Roman" w:hAnsi="Times New Roman" w:cs="Times New Roman"/>
-                <w:b/>
-                <w:sz w:val="18"/>
-                <w:szCs w:val="18"/>
-                <w:lang w:val="en-US"/>
-              </w:rPr>
-            </w:pPr>
-            <w:r>
-              <w:rPr>
-                <w:rFonts w:ascii="Times New Roman" w:hAnsi="Times New Roman" w:cs="Times New Roman"/>
-                <w:bCs/>
-                <w:sz w:val="18"/>
-                <w:szCs w:val="18"/>
-              </w:rPr>
-              <w:t>Личная</w:t>
-            </w:r>
-            <w:r>
-              <w:rPr>
-                <w:rFonts w:ascii="Times New Roman" w:hAnsi="Times New Roman" w:cs="Times New Roman"/>
-                <w:bCs/>
-                <w:sz w:val="18"/>
-                <w:szCs w:val="18"/>
-                <w:lang w:val="en-US"/>
-              </w:rPr>
-              <w:t xml:space="preserve"> </w:t>
-            </w:r>
-            <w:r>
-              <w:rPr>
-                <w:rFonts w:ascii="Times New Roman" w:hAnsi="Times New Roman" w:cs="Times New Roman"/>
-                <w:bCs/>
-                <w:sz w:val="18"/>
-                <w:szCs w:val="18"/>
-              </w:rPr>
-              <w:t>подпись</w:t>
-            </w:r>
-            <w:r>
-              <w:rPr>
-                <w:rFonts w:ascii="Times New Roman" w:hAnsi="Times New Roman" w:cs="Times New Roman"/>
-                <w:bCs/>
-                <w:sz w:val="20"/>
-                <w:szCs w:val="18"/>
-                <w:lang w:val="en-US"/>
-              </w:rPr>
-              <w:t xml:space="preserve">    </w:t>
+              </w:rPr>
+              <w:t xml:space="preserve">Личная подпись    </w:t>
             </w:r>
           </w:p>
         </w:tc>
@@ -854,7 +928,6 @@
                 <w:rFonts w:ascii="Times New Roman" w:hAnsi="Times New Roman" w:cs="Times New Roman"/>
                 <w:sz w:val="14"/>
                 <w:szCs w:val="14"/>
-                <w:lang w:val="en-US"/>
               </w:rPr>
             </w:pPr>
           </w:p>

</xml_diff>